<commit_message>
Criação do banco de dados e schemas do SISGESC
</commit_message>
<xml_diff>
--- a/docs/Dicionário dos dados.docx
+++ b/docs/Dicionário dos dados.docx
@@ -2601,6 +2601,16 @@
                 <w:lang w:val="pt-BR"/>
               </w:rPr>
             </w:pPr>
+            <w:r>
+              <w:rPr>
+                <w:rFonts w:ascii="Century Gothic" w:hAnsi="Century Gothic" w:cs="Times New Roman"/>
+                <w:color w:val="747474" w:themeColor="background2" w:themeShade="80"/>
+                <w:sz w:val="18"/>
+                <w:szCs w:val="18"/>
+                <w:lang w:val="pt-BR"/>
+              </w:rPr>
+              <w:t>NOT NULL</w:t>
+            </w:r>
           </w:p>
         </w:tc>
         <w:tc>
@@ -2956,7 +2966,17 @@
                 <w:szCs w:val="18"/>
                 <w:lang w:val="pt-BR"/>
               </w:rPr>
-              <w:t>pk_ddi</w:t>
+              <w:t>pk_</w:t>
+            </w:r>
+            <w:r>
+              <w:rPr>
+                <w:rFonts w:ascii="Century Gothic" w:hAnsi="Century Gothic" w:cs="Times New Roman"/>
+                <w:color w:val="747474" w:themeColor="background2" w:themeShade="80"/>
+                <w:sz w:val="18"/>
+                <w:szCs w:val="18"/>
+                <w:lang w:val="pt-BR"/>
+              </w:rPr>
+              <w:t>DDI</w:t>
             </w:r>
           </w:p>
         </w:tc>
@@ -2982,18 +3002,16 @@
                 <w:lang w:val="pt-BR"/>
               </w:rPr>
             </w:pPr>
-            <w:proofErr w:type="gramStart"/>
-            <w:r>
-              <w:rPr>
-                <w:rFonts w:ascii="Century Gothic" w:hAnsi="Century Gothic" w:cs="Times New Roman"/>
-                <w:color w:val="747474" w:themeColor="background2" w:themeShade="80"/>
-                <w:sz w:val="18"/>
-                <w:szCs w:val="18"/>
-                <w:lang w:val="pt-BR"/>
-              </w:rPr>
-              <w:t>VARCHAR(</w:t>
-            </w:r>
-            <w:proofErr w:type="gramEnd"/>
+            <w:r>
+              <w:rPr>
+                <w:rFonts w:ascii="Century Gothic" w:hAnsi="Century Gothic" w:cs="Times New Roman"/>
+                <w:color w:val="747474" w:themeColor="background2" w:themeShade="80"/>
+                <w:sz w:val="18"/>
+                <w:szCs w:val="18"/>
+                <w:lang w:val="pt-BR"/>
+              </w:rPr>
+              <w:t>VARCHAR (</w:t>
+            </w:r>
             <w:r>
               <w:rPr>
                 <w:rFonts w:ascii="Century Gothic" w:hAnsi="Century Gothic" w:cs="Times New Roman"/>
@@ -3133,18 +3151,36 @@
                 <w:lang w:val="pt-BR"/>
               </w:rPr>
             </w:pPr>
-            <w:proofErr w:type="spellStart"/>
-            <w:r>
-              <w:rPr>
-                <w:rFonts w:ascii="Century Gothic" w:hAnsi="Century Gothic" w:cs="Times New Roman"/>
-                <w:color w:val="747474" w:themeColor="background2" w:themeShade="80"/>
-                <w:sz w:val="18"/>
-                <w:szCs w:val="18"/>
-                <w:lang w:val="pt-BR"/>
-              </w:rPr>
-              <w:t>pk_ddd</w:t>
-            </w:r>
-            <w:proofErr w:type="spellEnd"/>
+            <w:r>
+              <w:rPr>
+                <w:rFonts w:ascii="Century Gothic" w:hAnsi="Century Gothic" w:cs="Times New Roman"/>
+                <w:color w:val="747474" w:themeColor="background2" w:themeShade="80"/>
+                <w:sz w:val="18"/>
+                <w:szCs w:val="18"/>
+                <w:lang w:val="pt-BR"/>
+              </w:rPr>
+              <w:t>P</w:t>
+            </w:r>
+            <w:r>
+              <w:rPr>
+                <w:rFonts w:ascii="Century Gothic" w:hAnsi="Century Gothic" w:cs="Times New Roman"/>
+                <w:color w:val="747474" w:themeColor="background2" w:themeShade="80"/>
+                <w:sz w:val="18"/>
+                <w:szCs w:val="18"/>
+                <w:lang w:val="pt-BR"/>
+              </w:rPr>
+              <w:t>k</w:t>
+            </w:r>
+            <w:r>
+              <w:rPr>
+                <w:rFonts w:ascii="Century Gothic" w:hAnsi="Century Gothic" w:cs="Times New Roman"/>
+                <w:color w:val="747474" w:themeColor="background2" w:themeShade="80"/>
+                <w:sz w:val="18"/>
+                <w:szCs w:val="18"/>
+                <w:lang w:val="pt-BR"/>
+              </w:rPr>
+              <w:t>_DDD</w:t>
+            </w:r>
           </w:p>
         </w:tc>
         <w:tc>
@@ -3169,18 +3205,16 @@
                 <w:lang w:val="pt-BR"/>
               </w:rPr>
             </w:pPr>
-            <w:proofErr w:type="gramStart"/>
-            <w:r>
-              <w:rPr>
-                <w:rFonts w:ascii="Century Gothic" w:hAnsi="Century Gothic" w:cs="Times New Roman"/>
-                <w:color w:val="747474" w:themeColor="background2" w:themeShade="80"/>
-                <w:sz w:val="18"/>
-                <w:szCs w:val="18"/>
-                <w:lang w:val="pt-BR"/>
-              </w:rPr>
-              <w:t>VARCHAR(</w:t>
-            </w:r>
-            <w:proofErr w:type="gramEnd"/>
+            <w:r>
+              <w:rPr>
+                <w:rFonts w:ascii="Century Gothic" w:hAnsi="Century Gothic" w:cs="Times New Roman"/>
+                <w:color w:val="747474" w:themeColor="background2" w:themeShade="80"/>
+                <w:sz w:val="18"/>
+                <w:szCs w:val="18"/>
+                <w:lang w:val="pt-BR"/>
+              </w:rPr>
+              <w:t>VARCHAR (</w:t>
+            </w:r>
             <w:r>
               <w:rPr>
                 <w:rFonts w:ascii="Century Gothic" w:hAnsi="Century Gothic" w:cs="Times New Roman"/>
@@ -3320,7 +3354,6 @@
                 <w:lang w:val="pt-BR"/>
               </w:rPr>
             </w:pPr>
-            <w:proofErr w:type="spellStart"/>
             <w:r>
               <w:rPr>
                 <w:rFonts w:ascii="Century Gothic" w:hAnsi="Century Gothic" w:cs="Times New Roman"/>
@@ -3331,19 +3364,26 @@
               </w:rPr>
               <w:t>pk_</w:t>
             </w:r>
-            <w:proofErr w:type="gramStart"/>
-            <w:r>
-              <w:rPr>
-                <w:rFonts w:ascii="Century Gothic" w:hAnsi="Century Gothic" w:cs="Times New Roman"/>
-                <w:color w:val="747474" w:themeColor="background2" w:themeShade="80"/>
-                <w:sz w:val="18"/>
-                <w:szCs w:val="18"/>
-                <w:lang w:val="pt-BR"/>
-              </w:rPr>
-              <w:t>numero</w:t>
-            </w:r>
-            <w:proofErr w:type="spellEnd"/>
-            <w:proofErr w:type="gramEnd"/>
+            <w:r>
+              <w:rPr>
+                <w:rFonts w:ascii="Century Gothic" w:hAnsi="Century Gothic" w:cs="Times New Roman"/>
+                <w:color w:val="747474" w:themeColor="background2" w:themeShade="80"/>
+                <w:sz w:val="18"/>
+                <w:szCs w:val="18"/>
+                <w:lang w:val="pt-BR"/>
+              </w:rPr>
+              <w:t>Numer</w:t>
+            </w:r>
+            <w:r>
+              <w:rPr>
+                <w:rFonts w:ascii="Century Gothic" w:hAnsi="Century Gothic" w:cs="Times New Roman"/>
+                <w:color w:val="747474" w:themeColor="background2" w:themeShade="80"/>
+                <w:sz w:val="18"/>
+                <w:szCs w:val="18"/>
+                <w:lang w:val="pt-BR"/>
+              </w:rPr>
+              <w:t>o</w:t>
+            </w:r>
           </w:p>
         </w:tc>
         <w:tc>
@@ -3368,18 +3408,16 @@
                 <w:lang w:val="pt-BR"/>
               </w:rPr>
             </w:pPr>
-            <w:proofErr w:type="gramStart"/>
-            <w:r>
-              <w:rPr>
-                <w:rFonts w:ascii="Century Gothic" w:hAnsi="Century Gothic" w:cs="Times New Roman"/>
-                <w:color w:val="747474" w:themeColor="background2" w:themeShade="80"/>
-                <w:sz w:val="18"/>
-                <w:szCs w:val="18"/>
-                <w:lang w:val="pt-BR"/>
-              </w:rPr>
-              <w:t>VARCHAR(</w:t>
-            </w:r>
-            <w:proofErr w:type="gramEnd"/>
+            <w:r>
+              <w:rPr>
+                <w:rFonts w:ascii="Century Gothic" w:hAnsi="Century Gothic" w:cs="Times New Roman"/>
+                <w:color w:val="747474" w:themeColor="background2" w:themeShade="80"/>
+                <w:sz w:val="18"/>
+                <w:szCs w:val="18"/>
+                <w:lang w:val="pt-BR"/>
+              </w:rPr>
+              <w:t>VARCHAR (</w:t>
+            </w:r>
             <w:r>
               <w:rPr>
                 <w:rFonts w:ascii="Century Gothic" w:hAnsi="Century Gothic" w:cs="Times New Roman"/>
@@ -3527,7 +3565,17 @@
                 <w:szCs w:val="18"/>
                 <w:lang w:val="pt-BR"/>
               </w:rPr>
-              <w:t>fk_cpf</w:t>
+              <w:t>fk_</w:t>
+            </w:r>
+            <w:r>
+              <w:rPr>
+                <w:rFonts w:ascii="Century Gothic" w:hAnsi="Century Gothic" w:cs="Times New Roman"/>
+                <w:color w:val="747474" w:themeColor="background2" w:themeShade="80"/>
+                <w:sz w:val="18"/>
+                <w:szCs w:val="18"/>
+                <w:lang w:val="pt-BR"/>
+              </w:rPr>
+              <w:t>CPF</w:t>
             </w:r>
           </w:p>
         </w:tc>
@@ -3553,18 +3601,16 @@
                 <w:lang w:val="pt-BR"/>
               </w:rPr>
             </w:pPr>
-            <w:proofErr w:type="gramStart"/>
-            <w:r>
-              <w:rPr>
-                <w:rFonts w:ascii="Century Gothic" w:hAnsi="Century Gothic" w:cs="Times New Roman"/>
-                <w:color w:val="747474" w:themeColor="background2" w:themeShade="80"/>
-                <w:sz w:val="18"/>
-                <w:szCs w:val="18"/>
-                <w:lang w:val="pt-BR"/>
-              </w:rPr>
-              <w:t>CHAR(</w:t>
-            </w:r>
-            <w:proofErr w:type="gramEnd"/>
+            <w:r>
+              <w:rPr>
+                <w:rFonts w:ascii="Century Gothic" w:hAnsi="Century Gothic" w:cs="Times New Roman"/>
+                <w:color w:val="747474" w:themeColor="background2" w:themeShade="80"/>
+                <w:sz w:val="18"/>
+                <w:szCs w:val="18"/>
+                <w:lang w:val="pt-BR"/>
+              </w:rPr>
+              <w:t>CHAR (</w:t>
+            </w:r>
             <w:r>
               <w:rPr>
                 <w:rFonts w:ascii="Century Gothic" w:hAnsi="Century Gothic" w:cs="Times New Roman"/>
@@ -3673,7 +3719,27 @@
                 <w:szCs w:val="18"/>
                 <w:lang w:val="pt-BR"/>
               </w:rPr>
-              <w:t>Permite relacionar contatos com pessoa</w:t>
+              <w:t xml:space="preserve">Permite </w:t>
+            </w:r>
+            <w:r>
+              <w:rPr>
+                <w:rFonts w:ascii="Century Gothic" w:hAnsi="Century Gothic" w:cs="Times New Roman"/>
+                <w:color w:val="747474" w:themeColor="background2" w:themeShade="80"/>
+                <w:sz w:val="18"/>
+                <w:szCs w:val="18"/>
+                <w:lang w:val="pt-BR"/>
+              </w:rPr>
+              <w:t>o relacionamento entre as tabelas e módulos</w:t>
+            </w:r>
+            <w:r>
+              <w:rPr>
+                <w:rFonts w:ascii="Century Gothic" w:hAnsi="Century Gothic" w:cs="Times New Roman"/>
+                <w:color w:val="747474" w:themeColor="background2" w:themeShade="80"/>
+                <w:sz w:val="18"/>
+                <w:szCs w:val="18"/>
+                <w:lang w:val="pt-BR"/>
+              </w:rPr>
+              <w:t xml:space="preserve"> (tb_pessoas)</w:t>
             </w:r>
           </w:p>
         </w:tc>
@@ -3704,18 +3770,46 @@
                 <w:lang w:val="pt-BR"/>
               </w:rPr>
             </w:pPr>
-            <w:proofErr w:type="spellStart"/>
-            <w:r>
-              <w:rPr>
-                <w:rFonts w:ascii="Century Gothic" w:hAnsi="Century Gothic" w:cs="Times New Roman"/>
-                <w:color w:val="747474" w:themeColor="background2" w:themeShade="80"/>
-                <w:sz w:val="18"/>
-                <w:szCs w:val="18"/>
-                <w:lang w:val="pt-BR"/>
-              </w:rPr>
-              <w:t>tipo_telefone</w:t>
-            </w:r>
-            <w:proofErr w:type="spellEnd"/>
+            <w:r>
+              <w:rPr>
+                <w:rFonts w:ascii="Century Gothic" w:hAnsi="Century Gothic" w:cs="Times New Roman"/>
+                <w:color w:val="747474" w:themeColor="background2" w:themeShade="80"/>
+                <w:sz w:val="18"/>
+                <w:szCs w:val="18"/>
+                <w:lang w:val="pt-BR"/>
+              </w:rPr>
+              <w:t>T</w:t>
+            </w:r>
+            <w:r>
+              <w:rPr>
+                <w:rFonts w:ascii="Century Gothic" w:hAnsi="Century Gothic" w:cs="Times New Roman"/>
+                <w:color w:val="747474" w:themeColor="background2" w:themeShade="80"/>
+                <w:sz w:val="18"/>
+                <w:szCs w:val="18"/>
+                <w:lang w:val="pt-BR"/>
+              </w:rPr>
+              <w:t>ipo_</w:t>
+            </w:r>
+            <w:r>
+              <w:rPr>
+                <w:rFonts w:ascii="Century Gothic" w:hAnsi="Century Gothic" w:cs="Times New Roman"/>
+                <w:color w:val="747474" w:themeColor="background2" w:themeShade="80"/>
+                <w:sz w:val="18"/>
+                <w:szCs w:val="18"/>
+                <w:lang w:val="pt-BR"/>
+              </w:rPr>
+              <w:t>T</w:t>
+            </w:r>
+            <w:r>
+              <w:rPr>
+                <w:rFonts w:ascii="Century Gothic" w:hAnsi="Century Gothic" w:cs="Times New Roman"/>
+                <w:color w:val="747474" w:themeColor="background2" w:themeShade="80"/>
+                <w:sz w:val="18"/>
+                <w:szCs w:val="18"/>
+                <w:lang w:val="pt-BR"/>
+              </w:rPr>
+              <w:t>elefone</w:t>
+            </w:r>
           </w:p>
         </w:tc>
         <w:tc>
@@ -3877,7 +3971,17 @@
                 <w:szCs w:val="18"/>
                 <w:lang w:val="pt-BR"/>
               </w:rPr>
-              <w:t>ativo</w:t>
+              <w:t>A</w:t>
+            </w:r>
+            <w:r>
+              <w:rPr>
+                <w:rFonts w:ascii="Century Gothic" w:hAnsi="Century Gothic" w:cs="Times New Roman"/>
+                <w:color w:val="747474" w:themeColor="background2" w:themeShade="80"/>
+                <w:sz w:val="18"/>
+                <w:szCs w:val="18"/>
+                <w:lang w:val="pt-BR"/>
+              </w:rPr>
+              <w:t>tivo</w:t>
             </w:r>
           </w:p>
         </w:tc>
@@ -4259,18 +4363,46 @@
                 <w:lang w:val="pt-BR"/>
               </w:rPr>
             </w:pPr>
-            <w:proofErr w:type="spellStart"/>
-            <w:r>
-              <w:rPr>
-                <w:rFonts w:ascii="Century Gothic" w:hAnsi="Century Gothic" w:cs="Times New Roman"/>
-                <w:color w:val="747474" w:themeColor="background2" w:themeShade="80"/>
-                <w:sz w:val="18"/>
-                <w:szCs w:val="18"/>
-                <w:lang w:val="pt-BR"/>
-              </w:rPr>
-              <w:t>cod_endereco</w:t>
-            </w:r>
-            <w:proofErr w:type="spellEnd"/>
+            <w:r>
+              <w:rPr>
+                <w:rFonts w:ascii="Century Gothic" w:hAnsi="Century Gothic" w:cs="Times New Roman"/>
+                <w:color w:val="747474" w:themeColor="background2" w:themeShade="80"/>
+                <w:sz w:val="18"/>
+                <w:szCs w:val="18"/>
+                <w:lang w:val="pt-BR"/>
+              </w:rPr>
+              <w:t>cod</w:t>
+            </w:r>
+            <w:r>
+              <w:rPr>
+                <w:rFonts w:ascii="Century Gothic" w:hAnsi="Century Gothic" w:cs="Times New Roman"/>
+                <w:color w:val="747474" w:themeColor="background2" w:themeShade="80"/>
+                <w:sz w:val="18"/>
+                <w:szCs w:val="18"/>
+                <w:lang w:val="pt-BR"/>
+              </w:rPr>
+              <w:t>_</w:t>
+            </w:r>
+            <w:r>
+              <w:rPr>
+                <w:rFonts w:ascii="Century Gothic" w:hAnsi="Century Gothic" w:cs="Times New Roman"/>
+                <w:color w:val="747474" w:themeColor="background2" w:themeShade="80"/>
+                <w:sz w:val="18"/>
+                <w:szCs w:val="18"/>
+                <w:lang w:val="pt-BR"/>
+              </w:rPr>
+              <w:t>E</w:t>
+            </w:r>
+            <w:r>
+              <w:rPr>
+                <w:rFonts w:ascii="Century Gothic" w:hAnsi="Century Gothic" w:cs="Times New Roman"/>
+                <w:color w:val="747474" w:themeColor="background2" w:themeShade="80"/>
+                <w:sz w:val="18"/>
+                <w:szCs w:val="18"/>
+                <w:lang w:val="pt-BR"/>
+              </w:rPr>
+              <w:t>ndereco</w:t>
+            </w:r>
           </w:p>
         </w:tc>
         <w:tc>
@@ -4403,7 +4535,7 @@
                 <w:szCs w:val="18"/>
                 <w:lang w:val="pt-BR"/>
               </w:rPr>
-              <w:t>Chave de controle interno</w:t>
+              <w:t>Identificador único para os endereços</w:t>
             </w:r>
           </w:p>
         </w:tc>
@@ -4442,7 +4574,17 @@
                 <w:szCs w:val="18"/>
                 <w:lang w:val="pt-BR"/>
               </w:rPr>
-              <w:t>fk_cpf</w:t>
+              <w:t>fk_</w:t>
+            </w:r>
+            <w:r>
+              <w:rPr>
+                <w:rFonts w:ascii="Century Gothic" w:hAnsi="Century Gothic" w:cs="Times New Roman"/>
+                <w:color w:val="747474" w:themeColor="background2" w:themeShade="80"/>
+                <w:sz w:val="18"/>
+                <w:szCs w:val="18"/>
+                <w:lang w:val="pt-BR"/>
+              </w:rPr>
+              <w:t>CPF</w:t>
             </w:r>
           </w:p>
         </w:tc>
@@ -4476,7 +4618,17 @@
                 <w:szCs w:val="18"/>
                 <w:lang w:val="pt-BR"/>
               </w:rPr>
-              <w:t>CHAR(11)</w:t>
+              <w:t>CHAR (</w:t>
+            </w:r>
+            <w:r>
+              <w:rPr>
+                <w:rFonts w:ascii="Century Gothic" w:hAnsi="Century Gothic" w:cs="Times New Roman"/>
+                <w:color w:val="747474" w:themeColor="background2" w:themeShade="80"/>
+                <w:sz w:val="18"/>
+                <w:szCs w:val="18"/>
+                <w:lang w:val="pt-BR"/>
+              </w:rPr>
+              <w:t>11)</w:t>
             </w:r>
           </w:p>
         </w:tc>
@@ -4615,7 +4767,17 @@
                 <w:szCs w:val="18"/>
                 <w:lang w:val="pt-BR"/>
               </w:rPr>
-              <w:t>cep</w:t>
+              <w:t>C</w:t>
+            </w:r>
+            <w:r>
+              <w:rPr>
+                <w:rFonts w:ascii="Century Gothic" w:hAnsi="Century Gothic" w:cs="Times New Roman"/>
+                <w:color w:val="747474" w:themeColor="background2" w:themeShade="80"/>
+                <w:sz w:val="18"/>
+                <w:szCs w:val="18"/>
+                <w:lang w:val="pt-BR"/>
+              </w:rPr>
+              <w:t>EP</w:t>
             </w:r>
           </w:p>
         </w:tc>
@@ -4649,7 +4811,17 @@
                 <w:szCs w:val="18"/>
                 <w:lang w:val="pt-BR"/>
               </w:rPr>
-              <w:t>VARCHAR(9)</w:t>
+              <w:t>VARCHAR (</w:t>
+            </w:r>
+            <w:r>
+              <w:rPr>
+                <w:rFonts w:ascii="Century Gothic" w:hAnsi="Century Gothic" w:cs="Times New Roman"/>
+                <w:color w:val="747474" w:themeColor="background2" w:themeShade="80"/>
+                <w:sz w:val="18"/>
+                <w:szCs w:val="18"/>
+                <w:lang w:val="pt-BR"/>
+              </w:rPr>
+              <w:t>9)</w:t>
             </w:r>
           </w:p>
         </w:tc>
@@ -4788,7 +4960,17 @@
                 <w:szCs w:val="18"/>
                 <w:lang w:val="pt-BR"/>
               </w:rPr>
-              <w:t>logradouro</w:t>
+              <w:t>L</w:t>
+            </w:r>
+            <w:r>
+              <w:rPr>
+                <w:rFonts w:ascii="Century Gothic" w:hAnsi="Century Gothic" w:cs="Times New Roman"/>
+                <w:color w:val="747474" w:themeColor="background2" w:themeShade="80"/>
+                <w:sz w:val="18"/>
+                <w:szCs w:val="18"/>
+                <w:lang w:val="pt-BR"/>
+              </w:rPr>
+              <w:t>ogradouro</w:t>
             </w:r>
           </w:p>
         </w:tc>
@@ -4961,7 +5143,17 @@
                 <w:szCs w:val="18"/>
                 <w:lang w:val="pt-BR"/>
               </w:rPr>
-              <w:t>numero</w:t>
+              <w:t>N</w:t>
+            </w:r>
+            <w:r>
+              <w:rPr>
+                <w:rFonts w:ascii="Century Gothic" w:hAnsi="Century Gothic" w:cs="Times New Roman"/>
+                <w:color w:val="747474" w:themeColor="background2" w:themeShade="80"/>
+                <w:sz w:val="18"/>
+                <w:szCs w:val="18"/>
+                <w:lang w:val="pt-BR"/>
+              </w:rPr>
+              <w:t>umero</w:t>
             </w:r>
           </w:p>
         </w:tc>
@@ -5134,7 +5326,17 @@
                 <w:szCs w:val="18"/>
                 <w:lang w:val="pt-BR"/>
               </w:rPr>
-              <w:t>complemento</w:t>
+              <w:t>C</w:t>
+            </w:r>
+            <w:r>
+              <w:rPr>
+                <w:rFonts w:ascii="Century Gothic" w:hAnsi="Century Gothic" w:cs="Times New Roman"/>
+                <w:color w:val="747474" w:themeColor="background2" w:themeShade="80"/>
+                <w:sz w:val="18"/>
+                <w:szCs w:val="18"/>
+                <w:lang w:val="pt-BR"/>
+              </w:rPr>
+              <w:t>omplemento</w:t>
             </w:r>
           </w:p>
         </w:tc>
@@ -5297,7 +5499,17 @@
                 <w:szCs w:val="18"/>
                 <w:lang w:val="pt-BR"/>
               </w:rPr>
-              <w:t>bairro</w:t>
+              <w:t>B</w:t>
+            </w:r>
+            <w:r>
+              <w:rPr>
+                <w:rFonts w:ascii="Century Gothic" w:hAnsi="Century Gothic" w:cs="Times New Roman"/>
+                <w:color w:val="747474" w:themeColor="background2" w:themeShade="80"/>
+                <w:sz w:val="18"/>
+                <w:szCs w:val="18"/>
+                <w:lang w:val="pt-BR"/>
+              </w:rPr>
+              <w:t>airro</w:t>
             </w:r>
           </w:p>
         </w:tc>
@@ -5470,7 +5682,17 @@
                 <w:szCs w:val="18"/>
                 <w:lang w:val="pt-BR"/>
               </w:rPr>
-              <w:t>cidade</w:t>
+              <w:t>C</w:t>
+            </w:r>
+            <w:r>
+              <w:rPr>
+                <w:rFonts w:ascii="Century Gothic" w:hAnsi="Century Gothic" w:cs="Times New Roman"/>
+                <w:color w:val="747474" w:themeColor="background2" w:themeShade="80"/>
+                <w:sz w:val="18"/>
+                <w:szCs w:val="18"/>
+                <w:lang w:val="pt-BR"/>
+              </w:rPr>
+              <w:t>idade</w:t>
             </w:r>
           </w:p>
         </w:tc>
@@ -5643,7 +5865,7 @@
                 <w:szCs w:val="18"/>
                 <w:lang w:val="pt-BR"/>
               </w:rPr>
-              <w:t>uf</w:t>
+              <w:t>UF</w:t>
             </w:r>
           </w:p>
         </w:tc>
@@ -5677,7 +5899,17 @@
                 <w:szCs w:val="18"/>
                 <w:lang w:val="pt-BR"/>
               </w:rPr>
-              <w:t>CHAR(2)</w:t>
+              <w:t>CHAR (</w:t>
+            </w:r>
+            <w:r>
+              <w:rPr>
+                <w:rFonts w:ascii="Century Gothic" w:hAnsi="Century Gothic" w:cs="Times New Roman"/>
+                <w:color w:val="747474" w:themeColor="background2" w:themeShade="80"/>
+                <w:sz w:val="18"/>
+                <w:szCs w:val="18"/>
+                <w:lang w:val="pt-BR"/>
+              </w:rPr>
+              <w:t>2)</w:t>
             </w:r>
           </w:p>
         </w:tc>

</xml_diff>